<commit_message>
vault backup: 2026-09-28 18:19:19
</commit_message>
<xml_diff>
--- a/ПРЕДМЕТЫ/Математические методы и модели поддержки принятия решений/Лабораторные работы/Отчёт_линейное_программирование_Поповкин_А_А_КИС_1.docx
+++ b/ПРЕДМЕТЫ/Математические методы и модели поддержки принятия решений/Лабораторные работы/Отчёт_линейное_программирование_Поповкин_А_А_КИС_1.docx
@@ -24,7 +24,7 @@
           <w:lang w:eastAsia="ru-RU"/>
         </w:rPr>
         <w:drawing>
-          <wp:anchor distT="0" distB="0" distL="114300" distR="114300" simplePos="0" relativeHeight="251659264" behindDoc="0" locked="0" layoutInCell="1" allowOverlap="1" wp14:anchorId="2598FB02" wp14:editId="3CAD13D3">
+          <wp:anchor distT="0" distB="0" distL="114300" distR="114300" simplePos="0" relativeHeight="251659264" behindDoc="0" locked="0" layoutInCell="1" allowOverlap="1" wp14:anchorId="2598FB02" wp14:editId="4C7F1F50">
             <wp:simplePos x="0" y="0"/>
             <wp:positionH relativeFrom="margin">
               <wp:posOffset>2897505</wp:posOffset>
@@ -1312,7 +1312,15 @@
           <w:szCs w:val="28"/>
         </w:rPr>
         <w:softHyphen/>
-        <w:t>мально возможные суточные запасы этих продуктов составляют 15</w:t>
+        <w:t xml:space="preserve">мально возможные суточные запасы этих продуктов составляют </w:t>
+      </w:r>
+      <w:r>
+        <w:rPr>
+          <w:rFonts w:ascii="Times New Roman" w:hAnsi="Times New Roman" w:cs="Times New Roman"/>
+          <w:sz w:val="28"/>
+          <w:szCs w:val="28"/>
+        </w:rPr>
+        <w:t>9</w:t>
       </w:r>
       <w:r>
         <w:rPr>
@@ -1328,7 +1336,23 @@
           <w:sz w:val="28"/>
           <w:szCs w:val="28"/>
         </w:rPr>
-        <w:t xml:space="preserve">и 18 тонн соответственно. Расходы продуктов </w:t>
+        <w:t>и 1</w:t>
+      </w:r>
+      <w:r>
+        <w:rPr>
+          <w:rFonts w:ascii="Times New Roman" w:hAnsi="Times New Roman" w:cs="Times New Roman"/>
+          <w:sz w:val="28"/>
+          <w:szCs w:val="28"/>
+        </w:rPr>
+        <w:t>2</w:t>
+      </w:r>
+      <w:r>
+        <w:rPr>
+          <w:rFonts w:ascii="Times New Roman" w:hAnsi="Times New Roman" w:cs="Times New Roman"/>
+          <w:sz w:val="28"/>
+          <w:szCs w:val="28"/>
+        </w:rPr>
+        <w:t xml:space="preserve"> тонн соответственно. Расходы продуктов </w:t>
       </w:r>
       <w:r>
         <w:rPr>
@@ -2689,7 +2713,6 @@
           <w:sz w:val="28"/>
           <w:szCs w:val="28"/>
           <w:vertAlign w:val="subscript"/>
-          <w:lang w:val="en-US"/>
         </w:rPr>
         <w:t>2</w:t>
       </w:r>
@@ -2732,7 +2755,6 @@
           <w:sz w:val="28"/>
           <w:szCs w:val="28"/>
           <w:vertAlign w:val="subscript"/>
-          <w:lang w:val="en-US"/>
         </w:rPr>
         <w:t>1</w:t>
       </w:r>
@@ -2765,7 +2787,6 @@
           <w:rFonts w:ascii="Times New Roman" w:hAnsi="Times New Roman" w:cs="Times New Roman"/>
           <w:sz w:val="28"/>
           <w:szCs w:val="28"/>
-          <w:lang w:val="en-US"/>
         </w:rPr>
         <w:t>1</w:t>
       </w:r>
@@ -2836,7 +2857,6 @@
           <w:rFonts w:ascii="Times New Roman" w:hAnsi="Times New Roman" w:cs="Times New Roman"/>
           <w:sz w:val="28"/>
           <w:szCs w:val="28"/>
-          <w:lang w:val="en-US"/>
         </w:rPr>
         <w:t>3</w:t>
       </w:r>
@@ -3423,7 +3443,6 @@
           <w:rFonts w:ascii="Times New Roman" w:hAnsi="Times New Roman" w:cs="Times New Roman"/>
           <w:sz w:val="28"/>
           <w:szCs w:val="28"/>
-          <w:lang w:val="en-US"/>
         </w:rPr>
       </w:pPr>
       <w:r>
@@ -3709,79 +3728,7 @@
           <w:sz w:val="28"/>
           <w:szCs w:val="28"/>
         </w:rPr>
-        <w:t xml:space="preserve">В раскрывающемся списке справа от поля Ссылка на ячейку выбирается условный оператор из списка: &lt;=, =, &gt;=, </w:t>
-      </w:r>
-      <w:proofErr w:type="spellStart"/>
-      <w:r>
-        <w:rPr>
-          <w:rFonts w:ascii="Times New Roman" w:hAnsi="Times New Roman" w:cs="Times New Roman"/>
-          <w:sz w:val="28"/>
-          <w:szCs w:val="28"/>
-        </w:rPr>
-        <w:t>int</w:t>
-      </w:r>
-      <w:proofErr w:type="spellEnd"/>
-      <w:r>
-        <w:rPr>
-          <w:rFonts w:ascii="Times New Roman" w:hAnsi="Times New Roman" w:cs="Times New Roman"/>
-          <w:sz w:val="28"/>
-          <w:szCs w:val="28"/>
-        </w:rPr>
-        <w:t xml:space="preserve"> или </w:t>
-      </w:r>
-      <w:proofErr w:type="spellStart"/>
-      <w:r>
-        <w:rPr>
-          <w:rFonts w:ascii="Times New Roman" w:hAnsi="Times New Roman" w:cs="Times New Roman"/>
-          <w:sz w:val="28"/>
-          <w:szCs w:val="28"/>
-        </w:rPr>
-        <w:t>bin</w:t>
-      </w:r>
-      <w:proofErr w:type="spellEnd"/>
-      <w:r>
-        <w:rPr>
-          <w:rFonts w:ascii="Times New Roman" w:hAnsi="Times New Roman" w:cs="Times New Roman"/>
-          <w:sz w:val="28"/>
-          <w:szCs w:val="28"/>
-        </w:rPr>
-        <w:t>, который должен соответствовать вводимому ограничению (</w:t>
-      </w:r>
-      <w:proofErr w:type="spellStart"/>
-      <w:r>
-        <w:rPr>
-          <w:rFonts w:ascii="Times New Roman" w:hAnsi="Times New Roman" w:cs="Times New Roman"/>
-          <w:sz w:val="28"/>
-          <w:szCs w:val="28"/>
-        </w:rPr>
-        <w:t>int</w:t>
-      </w:r>
-      <w:proofErr w:type="spellEnd"/>
-      <w:r>
-        <w:rPr>
-          <w:rFonts w:ascii="Times New Roman" w:hAnsi="Times New Roman" w:cs="Times New Roman"/>
-          <w:sz w:val="28"/>
-          <w:szCs w:val="28"/>
-        </w:rPr>
-        <w:t xml:space="preserve"> – целое число, </w:t>
-      </w:r>
-      <w:proofErr w:type="spellStart"/>
-      <w:r>
-        <w:rPr>
-          <w:rFonts w:ascii="Times New Roman" w:hAnsi="Times New Roman" w:cs="Times New Roman"/>
-          <w:sz w:val="28"/>
-          <w:szCs w:val="28"/>
-        </w:rPr>
-        <w:t>bin</w:t>
-      </w:r>
-      <w:proofErr w:type="spellEnd"/>
-      <w:r>
-        <w:rPr>
-          <w:rFonts w:ascii="Times New Roman" w:hAnsi="Times New Roman" w:cs="Times New Roman"/>
-          <w:sz w:val="28"/>
-          <w:szCs w:val="28"/>
-        </w:rPr>
-        <w:t xml:space="preserve"> – двоичное число). </w:t>
+        <w:t xml:space="preserve">В раскрывающемся списке справа от поля Ссылка на ячейку выбирается условный оператор из списка: &lt;=, =, &gt;=, int или bin, который должен соответствовать вводимому ограничению (int – целое число, bin – двоичное число). </w:t>
       </w:r>
     </w:p>
     <w:p>
@@ -4122,7 +4069,6 @@
           <w:rFonts w:ascii="Times New Roman" w:hAnsi="Times New Roman" w:cs="Times New Roman"/>
           <w:sz w:val="28"/>
           <w:szCs w:val="28"/>
-          <w:lang w:val="en-US"/>
         </w:rPr>
       </w:pPr>
       <w:r>

</xml_diff>

<commit_message>
vault backup: 2026-09-28 18:20:16
</commit_message>
<xml_diff>
--- a/ПРЕДМЕТЫ/Математические методы и модели поддержки принятия решений/Лабораторные работы/Отчёт_линейное_программирование_Поповкин_А_А_КИС_1.docx
+++ b/ПРЕДМЕТЫ/Математические методы и модели поддержки принятия решений/Лабораторные работы/Отчёт_линейное_программирование_Поповкин_А_А_КИС_1.docx
@@ -3237,7 +3237,6 @@
           <w:sz w:val="28"/>
           <w:szCs w:val="28"/>
         </w:rPr>
-        <w:lastRenderedPageBreak/>
         <w:tab/>
       </w:r>
       <w:r>
@@ -3245,10 +3244,10 @@
           <w:noProof/>
         </w:rPr>
         <w:drawing>
-          <wp:inline distT="0" distB="0" distL="0" distR="0" wp14:anchorId="7CF3A3C6" wp14:editId="2A88B69B">
-            <wp:extent cx="6300470" cy="4346575"/>
-            <wp:effectExtent l="0" t="0" r="5080" b="0"/>
-            <wp:docPr id="1030576" name="Рисунок 1"/>
+          <wp:inline distT="0" distB="0" distL="0" distR="0" wp14:anchorId="06992A58" wp14:editId="02605D29">
+            <wp:extent cx="6300470" cy="3540760"/>
+            <wp:effectExtent l="0" t="0" r="5080" b="2540"/>
+            <wp:docPr id="872903284" name="Рисунок 1"/>
             <wp:cNvGraphicFramePr>
               <a:graphicFrameLocks xmlns:a="http://schemas.openxmlformats.org/drawingml/2006/main" noChangeAspect="1"/>
             </wp:cNvGraphicFramePr>
@@ -3256,7 +3255,7 @@
               <a:graphicData uri="http://schemas.openxmlformats.org/drawingml/2006/picture">
                 <pic:pic xmlns:pic="http://schemas.openxmlformats.org/drawingml/2006/picture">
                   <pic:nvPicPr>
-                    <pic:cNvPr id="1030576" name=""/>
+                    <pic:cNvPr id="872903284" name=""/>
                     <pic:cNvPicPr/>
                   </pic:nvPicPr>
                   <pic:blipFill>
@@ -3268,7 +3267,7 @@
                   <pic:spPr>
                     <a:xfrm>
                       <a:off x="0" y="0"/>
-                      <a:ext cx="6300470" cy="4346575"/>
+                      <a:ext cx="6300470" cy="3540760"/>
                     </a:xfrm>
                     <a:prstGeom prst="rect">
                       <a:avLst/>
@@ -3298,6 +3297,7 @@
           <w:sz w:val="28"/>
           <w:szCs w:val="28"/>
         </w:rPr>
+        <w:lastRenderedPageBreak/>
         <w:t xml:space="preserve">Рисунок 1 – Подготовка рабочего листа к вычислениям с помощью надстройки «Поиск решения» в </w:t>
       </w:r>
       <w:r>
@@ -3396,7 +3396,6 @@
         <w:rPr>
           <w:noProof/>
         </w:rPr>
-        <w:lastRenderedPageBreak/>
         <w:drawing>
           <wp:inline distT="0" distB="0" distL="0" distR="0" wp14:anchorId="5D64BFA1" wp14:editId="4F160D62">
             <wp:extent cx="6300470" cy="5836920"/>
@@ -3471,7 +3470,26 @@
           <w:sz w:val="28"/>
           <w:szCs w:val="28"/>
         </w:rPr>
-        <w:t xml:space="preserve">2. В поле Установить целевую ячейку вводится </w:t>
+        <w:lastRenderedPageBreak/>
+        <w:t xml:space="preserve">2. В </w:t>
+      </w:r>
+      <w:proofErr w:type="gramStart"/>
+      <w:r>
+        <w:rPr>
+          <w:rFonts w:ascii="Times New Roman" w:hAnsi="Times New Roman" w:cs="Times New Roman"/>
+          <w:sz w:val="28"/>
+          <w:szCs w:val="28"/>
+        </w:rPr>
+        <w:t>поле</w:t>
+      </w:r>
+      <w:proofErr w:type="gramEnd"/>
+      <w:r>
+        <w:rPr>
+          <w:rFonts w:ascii="Times New Roman" w:hAnsi="Times New Roman" w:cs="Times New Roman"/>
+          <w:sz w:val="28"/>
+          <w:szCs w:val="28"/>
+        </w:rPr>
+        <w:t xml:space="preserve"> Установить целевую ячейку вводится </w:t>
       </w:r>
       <w:hyperlink r:id="rId11" w:history="1">
         <w:r>
@@ -3580,7 +3598,6 @@
           <w:sz w:val="28"/>
           <w:szCs w:val="28"/>
         </w:rPr>
-        <w:lastRenderedPageBreak/>
         <w:drawing>
           <wp:inline distT="0" distB="0" distL="0" distR="0" wp14:anchorId="5DD754E6" wp14:editId="28E0D519">
             <wp:extent cx="5029200" cy="1612900"/>
@@ -3728,7 +3745,97 @@
           <w:sz w:val="28"/>
           <w:szCs w:val="28"/>
         </w:rPr>
-        <w:t xml:space="preserve">В раскрывающемся списке справа от поля Ссылка на ячейку выбирается условный оператор из списка: &lt;=, =, &gt;=, int или bin, который должен соответствовать вводимому ограничению (int – целое число, bin – двоичное число). </w:t>
+        <w:t>В раскрывающемся списке справа от поля Ссылка на ячейку выбирается условный оператор из списка: &lt;=, =</w:t>
+      </w:r>
+      <w:proofErr w:type="gramStart"/>
+      <w:r>
+        <w:rPr>
+          <w:rFonts w:ascii="Times New Roman" w:hAnsi="Times New Roman" w:cs="Times New Roman"/>
+          <w:sz w:val="28"/>
+          <w:szCs w:val="28"/>
+        </w:rPr>
+        <w:t>, &gt;</w:t>
+      </w:r>
+      <w:proofErr w:type="gramEnd"/>
+      <w:r>
+        <w:rPr>
+          <w:rFonts w:ascii="Times New Roman" w:hAnsi="Times New Roman" w:cs="Times New Roman"/>
+          <w:sz w:val="28"/>
+          <w:szCs w:val="28"/>
+        </w:rPr>
+        <w:t xml:space="preserve">=, </w:t>
+      </w:r>
+      <w:proofErr w:type="spellStart"/>
+      <w:r>
+        <w:rPr>
+          <w:rFonts w:ascii="Times New Roman" w:hAnsi="Times New Roman" w:cs="Times New Roman"/>
+          <w:sz w:val="28"/>
+          <w:szCs w:val="28"/>
+        </w:rPr>
+        <w:t>int</w:t>
+      </w:r>
+      <w:proofErr w:type="spellEnd"/>
+      <w:r>
+        <w:rPr>
+          <w:rFonts w:ascii="Times New Roman" w:hAnsi="Times New Roman" w:cs="Times New Roman"/>
+          <w:sz w:val="28"/>
+          <w:szCs w:val="28"/>
+        </w:rPr>
+        <w:t xml:space="preserve"> или </w:t>
+      </w:r>
+      <w:proofErr w:type="spellStart"/>
+      <w:r>
+        <w:rPr>
+          <w:rFonts w:ascii="Times New Roman" w:hAnsi="Times New Roman" w:cs="Times New Roman"/>
+          <w:sz w:val="28"/>
+          <w:szCs w:val="28"/>
+        </w:rPr>
+        <w:t>bin</w:t>
+      </w:r>
+      <w:proofErr w:type="spellEnd"/>
+      <w:r>
+        <w:rPr>
+          <w:rFonts w:ascii="Times New Roman" w:hAnsi="Times New Roman" w:cs="Times New Roman"/>
+          <w:sz w:val="28"/>
+          <w:szCs w:val="28"/>
+        </w:rPr>
+        <w:t>, который должен соответствовать вводимому ограничению (</w:t>
+      </w:r>
+      <w:proofErr w:type="spellStart"/>
+      <w:r>
+        <w:rPr>
+          <w:rFonts w:ascii="Times New Roman" w:hAnsi="Times New Roman" w:cs="Times New Roman"/>
+          <w:sz w:val="28"/>
+          <w:szCs w:val="28"/>
+        </w:rPr>
+        <w:t>int</w:t>
+      </w:r>
+      <w:proofErr w:type="spellEnd"/>
+      <w:r>
+        <w:rPr>
+          <w:rFonts w:ascii="Times New Roman" w:hAnsi="Times New Roman" w:cs="Times New Roman"/>
+          <w:sz w:val="28"/>
+          <w:szCs w:val="28"/>
+        </w:rPr>
+        <w:t xml:space="preserve"> – целое число, </w:t>
+      </w:r>
+      <w:proofErr w:type="spellStart"/>
+      <w:r>
+        <w:rPr>
+          <w:rFonts w:ascii="Times New Roman" w:hAnsi="Times New Roman" w:cs="Times New Roman"/>
+          <w:sz w:val="28"/>
+          <w:szCs w:val="28"/>
+        </w:rPr>
+        <w:t>bin</w:t>
+      </w:r>
+      <w:proofErr w:type="spellEnd"/>
+      <w:r>
+        <w:rPr>
+          <w:rFonts w:ascii="Times New Roman" w:hAnsi="Times New Roman" w:cs="Times New Roman"/>
+          <w:sz w:val="28"/>
+          <w:szCs w:val="28"/>
+        </w:rPr>
+        <w:t xml:space="preserve"> – двоичное число). </w:t>
       </w:r>
     </w:p>
     <w:p>
@@ -3786,7 +3893,34 @@
           <w:sz w:val="28"/>
           <w:szCs w:val="28"/>
         </w:rPr>
-        <w:t>Установка флажка Линейная модель в диалоговом окне Параметры поиска  решения (см. рис. 11), которое открывается при нажатии на кнопку Параметры в окне Поиск решения, позволяет задать любое количество ограничений. При решении нелинейных задач на каждую из изменяющихся ячеек можно наложить до 100 ограничений (в дополнение к целочисленным ограничениям на переменные).</w:t>
+        <w:t xml:space="preserve">Установка флажка Линейная модель в диалоговом окне Параметры </w:t>
+      </w:r>
+      <w:proofErr w:type="gramStart"/>
+      <w:r>
+        <w:rPr>
+          <w:rFonts w:ascii="Times New Roman" w:hAnsi="Times New Roman" w:cs="Times New Roman"/>
+          <w:sz w:val="28"/>
+          <w:szCs w:val="28"/>
+        </w:rPr>
+        <w:t>поиска  решения</w:t>
+      </w:r>
+      <w:proofErr w:type="gramEnd"/>
+      <w:r>
+        <w:rPr>
+          <w:rFonts w:ascii="Times New Roman" w:hAnsi="Times New Roman" w:cs="Times New Roman"/>
+          <w:sz w:val="28"/>
+          <w:szCs w:val="28"/>
+        </w:rPr>
+        <w:t xml:space="preserve"> (см. рис. 11), которое открывается при нажатии на кнопку Параметры в окне Поиск решения, позволяет задать любое количество ограничений. При </w:t>
+      </w:r>
+      <w:r>
+        <w:rPr>
+          <w:rFonts w:ascii="Times New Roman" w:hAnsi="Times New Roman" w:cs="Times New Roman"/>
+          <w:sz w:val="28"/>
+          <w:szCs w:val="28"/>
+        </w:rPr>
+        <w:lastRenderedPageBreak/>
+        <w:t>решении нелинейных задач на каждую из изменяющихся ячеек можно наложить до 100 ограничений (в дополнение к целочисленным ограничениям на переменные).</w:t>
       </w:r>
     </w:p>
     <w:p>
@@ -3818,7 +3952,6 @@
           <w:sz w:val="28"/>
           <w:szCs w:val="28"/>
         </w:rPr>
-        <w:lastRenderedPageBreak/>
         <w:drawing>
           <wp:inline distT="0" distB="0" distL="0" distR="0" wp14:anchorId="545BD5E1" wp14:editId="6229029C">
             <wp:extent cx="4469936" cy="5571066"/>
@@ -3954,7 +4087,6 @@
           <w:sz w:val="28"/>
           <w:szCs w:val="28"/>
         </w:rPr>
-        <w:lastRenderedPageBreak/>
         <w:drawing>
           <wp:inline distT="0" distB="0" distL="0" distR="0" wp14:anchorId="5A560DC3" wp14:editId="325ACBAE">
             <wp:extent cx="5940425" cy="3952875"/>
@@ -4057,7 +4189,43 @@
           <w:sz w:val="28"/>
           <w:szCs w:val="28"/>
         </w:rPr>
-        <w:t xml:space="preserve">Чтобы сохранить найденное решение на листе, в диалоговом окне Результаты поиска решения выбирается вариант Сохранить найденное решение. Чтобы восстановить исходные данные, выбирается вариант Восстановить исходные значения. </w:t>
+        <w:t xml:space="preserve">Чтобы сохранить найденное решение на листе, в диалоговом окне Результаты поиска решения выбирается </w:t>
+      </w:r>
+      <w:proofErr w:type="gramStart"/>
+      <w:r>
+        <w:rPr>
+          <w:rFonts w:ascii="Times New Roman" w:hAnsi="Times New Roman" w:cs="Times New Roman"/>
+          <w:sz w:val="28"/>
+          <w:szCs w:val="28"/>
+        </w:rPr>
+        <w:t>вариант</w:t>
+      </w:r>
+      <w:proofErr w:type="gramEnd"/>
+      <w:r>
+        <w:rPr>
+          <w:rFonts w:ascii="Times New Roman" w:hAnsi="Times New Roman" w:cs="Times New Roman"/>
+          <w:sz w:val="28"/>
+          <w:szCs w:val="28"/>
+        </w:rPr>
+        <w:t xml:space="preserve"> Сохранить найденное решение. Чтобы восстановить исходные данные, выбирается </w:t>
+      </w:r>
+      <w:proofErr w:type="gramStart"/>
+      <w:r>
+        <w:rPr>
+          <w:rFonts w:ascii="Times New Roman" w:hAnsi="Times New Roman" w:cs="Times New Roman"/>
+          <w:sz w:val="28"/>
+          <w:szCs w:val="28"/>
+        </w:rPr>
+        <w:t>вариант</w:t>
+      </w:r>
+      <w:proofErr w:type="gramEnd"/>
+      <w:r>
+        <w:rPr>
+          <w:rFonts w:ascii="Times New Roman" w:hAnsi="Times New Roman" w:cs="Times New Roman"/>
+          <w:sz w:val="28"/>
+          <w:szCs w:val="28"/>
+        </w:rPr>
+        <w:t xml:space="preserve"> Восстановить исходные значения. </w:t>
       </w:r>
     </w:p>
     <w:p>
@@ -4077,7 +4245,25 @@
           <w:sz w:val="28"/>
           <w:szCs w:val="28"/>
         </w:rPr>
-        <w:t>6. После сохранения найденного решения, появится рабочий лист, изображённый на рисунке 6.</w:t>
+        <w:t xml:space="preserve">6. </w:t>
+      </w:r>
+      <w:proofErr w:type="gramStart"/>
+      <w:r>
+        <w:rPr>
+          <w:rFonts w:ascii="Times New Roman" w:hAnsi="Times New Roman" w:cs="Times New Roman"/>
+          <w:sz w:val="28"/>
+          <w:szCs w:val="28"/>
+        </w:rPr>
+        <w:t>После сохранения найденного решения,</w:t>
+      </w:r>
+      <w:proofErr w:type="gramEnd"/>
+      <w:r>
+        <w:rPr>
+          <w:rFonts w:ascii="Times New Roman" w:hAnsi="Times New Roman" w:cs="Times New Roman"/>
+          <w:sz w:val="28"/>
+          <w:szCs w:val="28"/>
+        </w:rPr>
+        <w:t xml:space="preserve"> появится рабочий лист, изображённый на рисунке 6.</w:t>
       </w:r>
     </w:p>
     <w:p>
@@ -4097,10 +4283,10 @@
         </w:rPr>
         <w:lastRenderedPageBreak/>
         <w:drawing>
-          <wp:inline distT="0" distB="0" distL="0" distR="0" wp14:anchorId="089ABAD5" wp14:editId="17403596">
-            <wp:extent cx="6300470" cy="4490720"/>
-            <wp:effectExtent l="0" t="0" r="5080" b="5080"/>
-            <wp:docPr id="134560355" name="Рисунок 1"/>
+          <wp:inline distT="0" distB="0" distL="0" distR="0" wp14:anchorId="118BA266" wp14:editId="3A4144C9">
+            <wp:extent cx="6300470" cy="3540760"/>
+            <wp:effectExtent l="0" t="0" r="5080" b="2540"/>
+            <wp:docPr id="862146382" name="Рисунок 1"/>
             <wp:cNvGraphicFramePr>
               <a:graphicFrameLocks xmlns:a="http://schemas.openxmlformats.org/drawingml/2006/main" noChangeAspect="1"/>
             </wp:cNvGraphicFramePr>
@@ -4108,7 +4294,7 @@
               <a:graphicData uri="http://schemas.openxmlformats.org/drawingml/2006/picture">
                 <pic:pic xmlns:pic="http://schemas.openxmlformats.org/drawingml/2006/picture">
                   <pic:nvPicPr>
-                    <pic:cNvPr id="134560355" name=""/>
+                    <pic:cNvPr id="862146382" name=""/>
                     <pic:cNvPicPr/>
                   </pic:nvPicPr>
                   <pic:blipFill>
@@ -4120,7 +4306,7 @@
                   <pic:spPr>
                     <a:xfrm>
                       <a:off x="0" y="0"/>
-                      <a:ext cx="6300470" cy="4490720"/>
+                      <a:ext cx="6300470" cy="3540760"/>
                     </a:xfrm>
                     <a:prstGeom prst="rect">
                       <a:avLst/>

</xml_diff>